<commit_message>
Editing and UX fixes
</commit_message>
<xml_diff>
--- a/apps/demo/public/fixtures/word-interop-smartart-embedded.docx
+++ b/apps/demo/public/fixtures/word-interop-smartart-embedded.docx
@@ -87,7 +87,7 @@
 <dgm:dataModel xmlns:dgm="http://schemas.openxmlformats.org/drawingml/2006/diagram" xmlns:a="http://schemas.openxmlformats.org/drawingml/2006/main">
   <dgm:ptLst>
     <dgm:pt modelId="0" type="doc">
-      <dgm:prSet loTypeId="urn:wordinweb:smartart:cycle" loCatId="cycle"/>
+      <dgm:prSet loTypeId="urn:wordinweb:smartart:cycle" loCatId="cycle" qsTypeId="urn:wordinweb:smartart:style" qsCatId="simple" csTypeId="urn:wordinweb:smartart:colors" csCatId="accent1"/>
       <dgm:spPr/>
       <dgm:t>
         <a:bodyPr/>
@@ -139,9 +139,9 @@
     </dgm:pt>
   </dgm:ptLst>
   <dgm:cxnLst>
-    <dgm:cxn modelId="4" srcId="0" destId="1" srcOrd="0" destOrd="0"/>
-    <dgm:cxn modelId="5" srcId="0" destId="2" srcOrd="1" destOrd="0"/>
-    <dgm:cxn modelId="6" srcId="0" destId="3" srcOrd="2" destOrd="0"/>
+    <dgm:cxn modelId="4" type="parOf" srcId="0" destId="1" srcOrd="0" destOrd="0" presId=""/>
+    <dgm:cxn modelId="5" type="parOf" srcId="0" destId="2" srcOrd="1" destOrd="0" presId=""/>
+    <dgm:cxn modelId="6" type="parOf" srcId="0" destId="3" srcOrd="2" destOrd="0" presId=""/>
   </dgm:cxnLst>
   <dgm:bg/>
   <dgm:whole/>
@@ -361,8 +361,35 @@
   <dgm:catLst>
     <dgm:cat type="cycle" pri="1000"/>
   </dgm:catLst>
-  <dgm:layoutNode name="root">
-    <dgm:alg type="composite"/>
+  <dgm:layoutNode name="diagram">
+    <dgm:alg type="lin"/>
+    <dgm:shape/>
+    <dgm:presOf/>
+    <dgm:constrLst>
+      <dgm:constr type="w" for="ch" forName="node" refType="w"/>
+      <dgm:constr op="equ" type="h" for="ch" forName="node"/>
+      <dgm:constr op="equ" type="primFontSz" for="ch" forName="node" val="65"/>
+    </dgm:constrLst>
+    <dgm:ruleLst/>
+    <dgm:forEach axis="ch" ptType="node">
+      <dgm:layoutNode name="node" styleLbl="node0">
+        <dgm:varLst>
+          <dgm:bulletEnabled val="true"/>
+        </dgm:varLst>
+        <dgm:alg type="tx"/>
+        <dgm:shape type="roundRect"/>
+        <dgm:presOf axis="desOrSelf" ptType="node"/>
+        <dgm:constrLst>
+          <dgm:constr type="tMarg" refType="primFontSz" fact="0.3"/>
+          <dgm:constr type="bMarg" refType="primFontSz" fact="0.3"/>
+          <dgm:constr type="lMarg" refType="primFontSz" fact="0.3"/>
+          <dgm:constr type="rMarg" refType="primFontSz" fact="0.3"/>
+        </dgm:constrLst>
+        <dgm:ruleLst>
+          <dgm:rule type="primFontSz" val="5"/>
+        </dgm:ruleLst>
+      </dgm:layoutNode>
+    </dgm:forEach>
   </dgm:layoutNode>
 </dgm:layoutDef>
 </file>

</xml_diff>